<commit_message>
update summary file with Sakshi's USC-ID
</commit_message>
<xml_diff>
--- a/Summary.docx
+++ b/Summary.docx
@@ -64,17 +64,7 @@
           <w:sz w:val="32"/>
           <w:szCs w:val="32"/>
         </w:rPr>
-        <w:t>CSCI-570 Group 89 Members</w:t>
-      </w:r>
-      <w:r>
-        <w:rPr>
-          <w:rFonts w:ascii="Arial" w:hAnsi="Arial" w:cs="Arial"/>
-          <w:b/>
-          <w:bCs/>
-          <w:sz w:val="32"/>
-          <w:szCs w:val="32"/>
-        </w:rPr>
-        <w:t xml:space="preserve">: </w:t>
+        <w:t xml:space="preserve">CSCI-570 Group 89 Members: </w:t>
       </w:r>
     </w:p>
     <w:p>
@@ -183,6 +173,14 @@
                 <w:rFonts w:ascii="Arial" w:hAnsi="Arial" w:cs="Arial"/>
               </w:rPr>
             </w:pPr>
+            <w:r>
+              <w:rPr>
+                <w:rFonts w:ascii="Arial" w:hAnsi="Arial" w:cs="Arial"/>
+                <w:color w:val="222222"/>
+                <w:shd w:val="clear" w:color="auto" w:fill="FFFFFF"/>
+              </w:rPr>
+              <w:t>5476035923</w:t>
+            </w:r>
           </w:p>
         </w:tc>
       </w:tr>
@@ -2160,13 +2158,7 @@
         <w:rPr>
           <w:rFonts w:ascii="Arial" w:hAnsi="Arial" w:cs="Arial"/>
         </w:rPr>
-        <w:t>Analysis of Memory Graph</w:t>
-      </w:r>
-      <w:r>
-        <w:rPr>
-          <w:rFonts w:ascii="Arial" w:hAnsi="Arial" w:cs="Arial"/>
-        </w:rPr>
-        <w:t xml:space="preserve">: </w:t>
+        <w:t xml:space="preserve">Analysis of Memory Graph: </w:t>
       </w:r>
     </w:p>
     <w:p>
@@ -2467,13 +2459,7 @@
         <w:rPr>
           <w:rFonts w:ascii="Arial" w:hAnsi="Arial" w:cs="Arial"/>
         </w:rPr>
-        <w:t>Analysis of CPU Usage Graph</w:t>
-      </w:r>
-      <w:r>
-        <w:rPr>
-          <w:rFonts w:ascii="Arial" w:hAnsi="Arial" w:cs="Arial"/>
-        </w:rPr>
-        <w:t xml:space="preserve">: </w:t>
+        <w:t xml:space="preserve">Analysis of CPU Usage Graph: </w:t>
       </w:r>
     </w:p>
     <w:p>
@@ -2657,14 +2643,10 @@
       <w:r>
         <w:rPr>
           <w:rFonts w:ascii="Arial" w:hAnsi="Arial" w:cs="Arial"/>
-        </w:rPr>
-        <w:t>8648410555:</w:t>
-      </w:r>
-      <w:r>
-        <w:rPr>
-          <w:rFonts w:ascii="Arial" w:hAnsi="Arial" w:cs="Arial"/>
-        </w:rPr>
-        <w:t xml:space="preserve"> </w:t>
+          <w:color w:val="222222"/>
+          <w:shd w:val="clear" w:color="auto" w:fill="FFFFFF"/>
+        </w:rPr>
+        <w:t xml:space="preserve">5476035923: </w:t>
       </w:r>
       <w:r>
         <w:rPr>
@@ -2685,6 +2667,27 @@
         <w:rPr>
           <w:rFonts w:ascii="Arial" w:hAnsi="Arial" w:cs="Arial"/>
         </w:rPr>
+        <w:t xml:space="preserve">8648410555: </w:t>
+      </w:r>
+      <w:r>
+        <w:rPr>
+          <w:rFonts w:ascii="Arial" w:hAnsi="Arial" w:cs="Arial"/>
+          <w:color w:val="000000"/>
+        </w:rPr>
+        <w:t>Equal Contribution</w:t>
+      </w:r>
+    </w:p>
+    <w:p>
+      <w:pPr>
+        <w:rPr>
+          <w:rFonts w:ascii="Arial" w:hAnsi="Arial" w:cs="Arial"/>
+          <w:color w:val="000000"/>
+        </w:rPr>
+      </w:pPr>
+      <w:r>
+        <w:rPr>
+          <w:rFonts w:ascii="Arial" w:hAnsi="Arial" w:cs="Arial"/>
+        </w:rPr>
         <w:t xml:space="preserve">&lt;USC ID/s&gt;: </w:t>
       </w:r>
       <w:r>
@@ -2727,40 +2730,7 @@
         <w:rPr>
           <w:rFonts w:ascii="Arial" w:hAnsi="Arial" w:cs="Arial"/>
         </w:rPr>
-        <w:t>&lt;USC ID/s&gt;:</w:t>
-      </w:r>
-      <w:r>
-        <w:rPr>
-          <w:rFonts w:ascii="Arial" w:hAnsi="Arial" w:cs="Arial"/>
-        </w:rPr>
-        <w:t xml:space="preserve"> </w:t>
-      </w:r>
-      <w:r>
-        <w:rPr>
-          <w:rFonts w:ascii="Arial" w:hAnsi="Arial" w:cs="Arial"/>
-          <w:color w:val="000000"/>
-        </w:rPr>
-        <w:t>Equal Contribution</w:t>
-      </w:r>
-    </w:p>
-    <w:p>
-      <w:pPr>
-        <w:rPr>
-          <w:rFonts w:ascii="Arial" w:hAnsi="Arial" w:cs="Arial"/>
-          <w:color w:val="000000"/>
-        </w:rPr>
-      </w:pPr>
-      <w:r>
-        <w:rPr>
-          <w:rFonts w:ascii="Arial" w:hAnsi="Arial" w:cs="Arial"/>
-        </w:rPr>
-        <w:t>9415230993</w:t>
-      </w:r>
-      <w:r>
-        <w:rPr>
-          <w:rFonts w:ascii="Arial" w:hAnsi="Arial" w:cs="Arial"/>
-        </w:rPr>
-        <w:t xml:space="preserve">: </w:t>
+        <w:t xml:space="preserve">9415230993: </w:t>
       </w:r>
       <w:r>
         <w:rPr>

</xml_diff>

<commit_message>
create summary PDF, create submission folder for review
</commit_message>
<xml_diff>
--- a/Summary.docx
+++ b/Summary.docx
@@ -265,6 +265,12 @@
                 <w:rFonts w:ascii="Arial" w:hAnsi="Arial" w:cs="Arial"/>
               </w:rPr>
             </w:pPr>
+            <w:r>
+              <w:rPr>
+                <w:rFonts w:ascii="Arial" w:hAnsi="Arial" w:cs="Arial"/>
+              </w:rPr>
+              <w:t>9495840729</w:t>
+            </w:r>
           </w:p>
         </w:tc>
       </w:tr>
@@ -312,6 +318,12 @@
                 <w:rFonts w:ascii="Arial" w:hAnsi="Arial" w:cs="Arial"/>
               </w:rPr>
             </w:pPr>
+            <w:r>
+              <w:rPr>
+                <w:rFonts w:ascii="Arial" w:hAnsi="Arial" w:cs="Arial"/>
+              </w:rPr>
+              <w:t>7516524638</w:t>
+            </w:r>
           </w:p>
         </w:tc>
       </w:tr>
@@ -2688,7 +2700,13 @@
         <w:rPr>
           <w:rFonts w:ascii="Arial" w:hAnsi="Arial" w:cs="Arial"/>
         </w:rPr>
-        <w:t xml:space="preserve">&lt;USC ID/s&gt;: </w:t>
+        <w:t>9495840729</w:t>
+      </w:r>
+      <w:r>
+        <w:rPr>
+          <w:rFonts w:ascii="Arial" w:hAnsi="Arial" w:cs="Arial"/>
+        </w:rPr>
+        <w:t xml:space="preserve">: </w:t>
       </w:r>
       <w:r>
         <w:rPr>
@@ -2709,7 +2727,13 @@
         <w:rPr>
           <w:rFonts w:ascii="Arial" w:hAnsi="Arial" w:cs="Arial"/>
         </w:rPr>
-        <w:t xml:space="preserve">&lt;USC ID/s&gt;: </w:t>
+        <w:t>7516524638</w:t>
+      </w:r>
+      <w:r>
+        <w:rPr>
+          <w:rFonts w:ascii="Arial" w:hAnsi="Arial" w:cs="Arial"/>
+        </w:rPr>
+        <w:t xml:space="preserve">: </w:t>
       </w:r>
       <w:r>
         <w:rPr>

</xml_diff>